<commit_message>
Update: Integrate NeuroKit2, Plotly interactive plots, and multi-format loaders
</commit_message>
<xml_diff>
--- a/validation_results/ecg_afib_raw_report.docx
+++ b/validation_results/ecg_afib_raw_report.docx
@@ -122,12 +122,12 @@
         <w:br/>
         <w:t>3.2 P-QRS-T Noise Suppression (Butterworth Bandpass)</w:t>
         <w:br/>
-        <w:t>To capture ECG waves, a 3rd-order Butterworth bandpass filter is designed with a passband of 0.5 to 45.0 Hz. This band suppresses low-frequency breathing drifts and high-frequency 50/60 Hz powerline interference. It is applied using double-pass filtering (scipy.signal.filtfilt), enforcing zero phase shift to prevent shifting QRS peaks in time.</w:t>
+        <w:t>To capture ECG waves, a 3rd-order Butterworth bandpass filter is designed with a passband of 0.5 to 40.0 Hz. This band suppresses low-frequency breathing drifts and high-frequency 50/60 Hz powerline interference. It is applied using double-pass filtering (scipy.signal.filtfilt), enforcing zero phase shift to prevent shifting QRS peaks in time.</w:t>
         <w:br/>
         <w:br/>
-        <w:t>3.3 Moving Enveloping (Pan-Tompkins Algorithm)</w:t>
+        <w:t>3.3 QRS R-Peak Detection Method (NeuroKit2 (Default))</w:t>
         <w:br/>
-        <w:t>The Pan-Tompkins algorithm isolates QRS complexes using a derivative stage, a squaring operation, and a moving window integrator (150ms window size). This integration tracks the energy envelope of the QRS complex. R-peaks are identified using adaptive dual thresholds: the signal threshold adapts to standard beat heights while the noise threshold adjusts to muscular baseline tremors.</w:t>
+        <w:t>R-peak extraction is executed using the 'NeuroKit2 (Default)' algorithm. The Pan-Tompkins method isolates QRS complexes using a derivative stage, a squaring operation, and a moving window integrator (150ms window size), applying adaptive dual-thresholding with back-search and refractory checks. Alternative NeuroKit2 detectors apply advanced mathematical filtering and adaptive peak profiling to locate complexes.</w:t>
       </w:r>
     </w:p>
     <w:p>
@@ -404,7 +404,7 @@
     </w:p>
     <w:p>
       <w:r>
-        <w:t>Ectopic Correction Audit: Detected 15 ectopic events out of 90 total beats (16.85% ectopic burden). Ectopic intervals were reconstructed using cubic spline interpolation.</w:t>
+        <w:t>Ectopic Correction Audit: Detected 12 ectopic events out of 87 total beats (13.95% ectopic burden). Ectopic intervals were reconstructed using cubic spline interpolation.</w:t>
       </w:r>
     </w:p>
     <w:tbl>
@@ -478,7 +478,7 @@
           </w:tcPr>
           <w:p>
             <w:r>
-              <w:t>655.1 ms</w:t>
+              <w:t>680.5 ms</w:t>
             </w:r>
           </w:p>
         </w:tc>
@@ -520,7 +520,7 @@
           </w:tcPr>
           <w:p>
             <w:r>
-              <w:t>91.6 BPM</w:t>
+              <w:t>88.2 BPM</w:t>
             </w:r>
           </w:p>
         </w:tc>
@@ -562,7 +562,7 @@
           </w:tcPr>
           <w:p>
             <w:r>
-              <w:t>60.2 ms</w:t>
+              <w:t>79.0 ms</w:t>
             </w:r>
           </w:p>
         </w:tc>
@@ -604,7 +604,7 @@
           </w:tcPr>
           <w:p>
             <w:r>
-              <w:t>64.4 ms</w:t>
+              <w:t>69.8 ms</w:t>
             </w:r>
           </w:p>
         </w:tc>
@@ -646,7 +646,7 @@
           </w:tcPr>
           <w:p>
             <w:r>
-              <w:t>40.9 %</w:t>
+              <w:t>54.1 %</w:t>
             </w:r>
           </w:p>
         </w:tc>
@@ -688,7 +688,7 @@
           </w:tcPr>
           <w:p>
             <w:r>
-              <w:t>1540.2 ms²</w:t>
+              <w:t>1553.6 ms²</w:t>
             </w:r>
           </w:p>
         </w:tc>
@@ -730,7 +730,7 @@
           </w:tcPr>
           <w:p>
             <w:r>
-              <w:t>1152.8 ms²</w:t>
+              <w:t>2336.5 ms²</w:t>
             </w:r>
           </w:p>
         </w:tc>
@@ -772,7 +772,7 @@
           </w:tcPr>
           <w:p>
             <w:r>
-              <w:t>1.34</w:t>
+              <w:t>0.66</w:t>
             </w:r>
           </w:p>
         </w:tc>
@@ -814,7 +814,7 @@
           </w:tcPr>
           <w:p>
             <w:r>
-              <w:t>45.8 ms</w:t>
+              <w:t>49.6 ms</w:t>
             </w:r>
           </w:p>
         </w:tc>
@@ -856,7 +856,7 @@
           </w:tcPr>
           <w:p>
             <w:r>
-              <w:t>71.7 ms</w:t>
+              <w:t>100.1 ms</w:t>
             </w:r>
           </w:p>
         </w:tc>
@@ -898,7 +898,7 @@
           </w:tcPr>
           <w:p>
             <w:r>
-              <w:t>1.726</w:t>
+              <w:t>2.100</w:t>
             </w:r>
           </w:p>
         </w:tc>
@@ -939,17 +939,17 @@
     </w:p>
     <w:p>
       <w:r>
-        <w:t>**Autonomic Vagal Assessment (RMSSD = 64.4 ms, SD1 = 45.8 ms):**</w:t>
+        <w:t>**Autonomic Vagal Assessment (RMSSD = 69.8 ms, SD1 = 49.6 ms):**</w:t>
         <w:br/>
         <w:t>High / Robust vagal (parasympathetic) tone. This indicates good cardiovascular fitness, high vagal control, and healthy autonomic recovery.</w:t>
         <w:br/>
         <w:br/>
-        <w:t>**Sympathovagal Balance (LF/HF Ratio = 1.34):**</w:t>
+        <w:t>**Sympathovagal Balance (LF/HF Ratio = 0.66):**</w:t>
         <w:br/>
-        <w:t>Balanced autonomic state (LF/HF = 1.34). Reflects healthy homeostatic equilibrium between the sympathetic and parasympathetic branches.</w:t>
+        <w:t>Balanced autonomic state (LF/HF = 0.66). Reflects healthy homeostatic equilibrium between the sympathetic and parasympathetic branches.</w:t>
         <w:br/>
         <w:br/>
-        <w:t>**Non-Linear Adaptability (Sample Entropy = 1.726, SD2 = 71.7 ms):**</w:t>
+        <w:t>**Non-Linear Adaptability (Sample Entropy = 2.100, SD2 = 100.1 ms):**</w:t>
         <w:br/>
         <w:t>High complexity and healthy physiological adaptability. The cardiac pacemaker behaves non-linearly, showing normal chaotic fluctuations that allow rapid adaptation to external stimuli.</w:t>
       </w:r>

</xml_diff>